<commit_message>
docs: correct ESConv baseline notes
</commit_message>
<xml_diff>
--- a/reports/ESConv_simple_notes_20260810.docx
+++ b/reports/ESConv_simple_notes_20260810.docx
@@ -8,7 +8,7 @@
         <w:jc w:val="center"/>
       </w:pPr>
       <w:r>
-        <w:t>ESConv 简明记录</w:t>
+        <w:t>ESConv 简明记录（修正版）</w:t>
       </w:r>
     </w:p>
     <w:p>
@@ -16,7 +16,7 @@
         <w:jc w:val="center"/>
       </w:pPr>
       <w:r>
-        <w:t>以 2021 原论文 Joint 模型作为 baseline</w:t>
+        <w:t>2021 ESC Blender Joint 作为历史 baseline</w:t>
       </w:r>
     </w:p>
     <w:p>
@@ -28,16 +28,24 @@
       </w:r>
     </w:p>
     <w:p>
+      <w:r>
+        <w:rPr>
+          <w:b/>
+        </w:rPr>
+        <w:t>重要修正：旧的 19.60% / 20.40% 来自错误的 checkpoint token 映射，已经撤回，不再使用。</w:t>
+      </w:r>
+    </w:p>
+    <w:p>
       <w:pPr>
         <w:pStyle w:val="Heading1"/>
       </w:pPr>
       <w:r>
-        <w:t>1. 先定 baseline</w:t>
+        <w:t>1. baseline 怎么定</w:t>
       </w:r>
     </w:p>
     <w:p>
       <w:r>
-        <w:t>本项目不再把 Causal-ESC 的 53.53% 当 baseline。baseline 改成 2021 年 ESConv 原论文的 ESC Blender Joint 模型。</w:t>
+        <w:t>本项目把 2021 年 ESC Blender Joint 模型作为历史 baseline。Causal-ESC 的 53.53%只作为后续文献参考，不再叫 baseline。</w:t>
       </w:r>
     </w:p>
     <w:tbl>
@@ -56,43 +64,52 @@
       <w:tr>
         <w:tc>
           <w:tcPr>
-            <w:tcW w:type="dxa" w:w="2948"/>
+            <w:tcW w:type="dxa" w:w="2721"/>
           </w:tcPr>
           <w:p>
+            <w:pPr>
+              <w:spacing w:after="0"/>
+            </w:pPr>
             <w:r>
               <w:rPr>
                 <w:b/>
                 <w:sz w:val="20"/>
               </w:rPr>
-              <w:t>任务</w:t>
+              <w:t>范围</w:t>
             </w:r>
           </w:p>
         </w:tc>
         <w:tc>
           <w:tcPr>
-            <w:tcW w:type="dxa" w:w="2948"/>
+            <w:tcW w:type="dxa" w:w="3402"/>
           </w:tcPr>
           <w:p>
+            <w:pPr>
+              <w:spacing w:after="0"/>
+            </w:pPr>
             <w:r>
               <w:rPr>
                 <w:b/>
                 <w:sz w:val="20"/>
               </w:rPr>
-              <w:t>2021 baseline</w:t>
+              <w:t>历史 baseline</w:t>
             </w:r>
           </w:p>
         </w:tc>
         <w:tc>
           <w:tcPr>
-            <w:tcW w:type="dxa" w:w="3515"/>
+            <w:tcW w:type="dxa" w:w="3402"/>
           </w:tcPr>
           <w:p>
+            <w:pPr>
+              <w:spacing w:after="0"/>
+            </w:pPr>
             <w:r>
               <w:rPr>
                 <w:b/>
                 <w:sz w:val="20"/>
               </w:rPr>
-              <w:t>数字从哪里来</w:t>
+              <w:t>说明</w:t>
             </w:r>
           </w:p>
         </w:tc>
@@ -100,7 +117,7 @@
       <w:tr>
         <w:tc>
           <w:tcPr>
-            <w:tcW w:type="dxa" w:w="2948"/>
+            <w:tcW w:type="dxa" w:w="2721"/>
           </w:tcPr>
           <w:p>
             <w:pPr>
@@ -110,13 +127,13 @@
               <w:rPr>
                 <w:sz w:val="20"/>
               </w:rPr>
-              <w:t>8 类策略预测（官方全量 test）</w:t>
+              <w:t>官方 full 2,775 条</w:t>
             </w:r>
           </w:p>
         </w:tc>
         <w:tc>
           <w:tcPr>
-            <w:tcW w:type="dxa" w:w="2948"/>
+            <w:tcW w:type="dxa" w:w="3402"/>
           </w:tcPr>
           <w:p>
             <w:pPr>
@@ -126,13 +143,13 @@
               <w:rPr>
                 <w:sz w:val="20"/>
               </w:rPr>
-              <w:t>Accuracy 19.60%</w:t>
+              <w:t>Accuracy 暂定 32.22%（894/2,775）</w:t>
             </w:r>
           </w:p>
         </w:tc>
         <w:tc>
           <w:tcPr>
-            <w:tcW w:type="dxa" w:w="3515"/>
+            <w:tcW w:type="dxa" w:w="3402"/>
           </w:tcPr>
           <w:p>
             <w:pPr>
@@ -142,7 +159,7 @@
               <w:rPr>
                 <w:sz w:val="20"/>
               </w:rPr>
-              <w:t>作者官方 Joint 权重，本地复算 544/2,775</w:t>
+              <w:t>修正 token 映射后的官方 checkpoint 重放</w:t>
             </w:r>
           </w:p>
         </w:tc>
@@ -150,7 +167,7 @@
       <w:tr>
         <w:tc>
           <w:tcPr>
-            <w:tcW w:type="dxa" w:w="2948"/>
+            <w:tcW w:type="dxa" w:w="2721"/>
           </w:tcPr>
           <w:p>
             <w:pPr>
@@ -160,13 +177,13 @@
               <w:rPr>
                 <w:sz w:val="20"/>
               </w:rPr>
-              <w:t>8 类策略预测（固定前 250 条）</w:t>
+              <w:t>固定前 250 条</w:t>
             </w:r>
           </w:p>
         </w:tc>
         <w:tc>
           <w:tcPr>
-            <w:tcW w:type="dxa" w:w="2948"/>
+            <w:tcW w:type="dxa" w:w="3402"/>
           </w:tcPr>
           <w:p>
             <w:pPr>
@@ -176,13 +193,13 @@
               <w:rPr>
                 <w:sz w:val="20"/>
               </w:rPr>
-              <w:t>Accuracy 20.40%</w:t>
+              <w:t>Accuracy 暂定 37.60%（94/250）</w:t>
             </w:r>
           </w:p>
         </w:tc>
         <w:tc>
           <w:tcPr>
-            <w:tcW w:type="dxa" w:w="3515"/>
+            <w:tcW w:type="dxa" w:w="3402"/>
           </w:tcPr>
           <w:p>
             <w:pPr>
@@ -192,7 +209,124 @@
               <w:rPr>
                 <w:sz w:val="20"/>
               </w:rPr>
-              <w:t>作者官方 Joint 权重，本地复算 51/250</w:t>
+              <w:t>用于和 DeepSeek、Qwen 做同批比较</w:t>
+            </w:r>
+          </w:p>
+        </w:tc>
+      </w:tr>
+    </w:tbl>
+    <w:p/>
+    <w:p>
+      <w:r>
+        <w:t>“暂定”的原因：2021 原论文没有公开策略分类 Accuracy。这两个数字是 checkpoint 重放结果，还需要在 Python 3.7、Torch 1.7.1 和作者自带 Transformers 的冻结环境里复验并保存逐样本预测。</w:t>
+      </w:r>
+    </w:p>
+    <w:p>
+      <w:pPr>
+        <w:pStyle w:val="Heading1"/>
+      </w:pPr>
+      <w:r>
+        <w:t>2. 当前三个模型的准确率</w:t>
+      </w:r>
+    </w:p>
+    <w:tbl>
+      <w:tblPr>
+        <w:tblStyle w:val="TableGrid"/>
+        <w:tblW w:type="auto" w:w="0"/>
+        <w:jc w:val="center"/>
+        <w:tblLayout w:type="fixed"/>
+        <w:tblLook w:firstColumn="1" w:firstRow="1" w:lastColumn="0" w:lastRow="0" w:noHBand="0" w:noVBand="1" w:val="04A0"/>
+      </w:tblPr>
+      <w:tblGrid>
+        <w:gridCol w:w="1949"/>
+        <w:gridCol w:w="1949"/>
+        <w:gridCol w:w="1949"/>
+        <w:gridCol w:w="1949"/>
+        <w:gridCol w:w="1949"/>
+      </w:tblGrid>
+      <w:tr>
+        <w:tc>
+          <w:tcPr>
+            <w:tcW w:type="dxa" w:w="2381"/>
+          </w:tcPr>
+          <w:p>
+            <w:pPr>
+              <w:spacing w:after="0"/>
+            </w:pPr>
+            <w:r>
+              <w:rPr>
+                <w:b/>
+                <w:sz w:val="20"/>
+              </w:rPr>
+              <w:t>模型</w:t>
+            </w:r>
+          </w:p>
+        </w:tc>
+        <w:tc>
+          <w:tcPr>
+            <w:tcW w:type="dxa" w:w="1474"/>
+          </w:tcPr>
+          <w:p>
+            <w:pPr>
+              <w:spacing w:after="0"/>
+            </w:pPr>
+            <w:r>
+              <w:rPr>
+                <w:b/>
+                <w:sz w:val="20"/>
+              </w:rPr>
+              <w:t>测试范围</w:t>
+            </w:r>
+          </w:p>
+        </w:tc>
+        <w:tc>
+          <w:tcPr>
+            <w:tcW w:type="dxa" w:w="1474"/>
+          </w:tcPr>
+          <w:p>
+            <w:pPr>
+              <w:spacing w:after="0"/>
+            </w:pPr>
+            <w:r>
+              <w:rPr>
+                <w:b/>
+                <w:sz w:val="20"/>
+              </w:rPr>
+              <w:t>Accuracy</w:t>
+            </w:r>
+          </w:p>
+        </w:tc>
+        <w:tc>
+          <w:tcPr>
+            <w:tcW w:type="dxa" w:w="1474"/>
+          </w:tcPr>
+          <w:p>
+            <w:pPr>
+              <w:spacing w:after="0"/>
+            </w:pPr>
+            <w:r>
+              <w:rPr>
+                <w:b/>
+                <w:sz w:val="20"/>
+              </w:rPr>
+              <w:t>正确数</w:t>
+            </w:r>
+          </w:p>
+        </w:tc>
+        <w:tc>
+          <w:tcPr>
+            <w:tcW w:type="dxa" w:w="2665"/>
+          </w:tcPr>
+          <w:p>
+            <w:pPr>
+              <w:spacing w:after="0"/>
+            </w:pPr>
+            <w:r>
+              <w:rPr>
+                <w:b/>
+                <w:sz w:val="20"/>
+              </w:rPr>
+              <w:t>距离历史 baseline</w:t>
             </w:r>
           </w:p>
         </w:tc>
@@ -200,7 +334,7 @@
       <w:tr>
         <w:tc>
           <w:tcPr>
-            <w:tcW w:type="dxa" w:w="2948"/>
+            <w:tcW w:type="dxa" w:w="2381"/>
           </w:tcPr>
           <w:p>
             <w:pPr>
@@ -210,13 +344,13 @@
               <w:rPr>
                 <w:sz w:val="20"/>
               </w:rPr>
-              <w:t>回答生成</w:t>
+              <w:t>ESC Blender Joint</w:t>
             </w:r>
           </w:p>
         </w:tc>
         <w:tc>
           <w:tcPr>
-            <w:tcW w:type="dxa" w:w="2948"/>
+            <w:tcW w:type="dxa" w:w="1474"/>
           </w:tcPr>
           <w:p>
             <w:pPr>
@@ -226,13 +360,13 @@
               <w:rPr>
                 <w:sz w:val="20"/>
               </w:rPr>
-              <w:t>BLEU-2 5.35；ROUGE-L 15.46；Extrema 50.27</w:t>
+              <w:t>fixed250</w:t>
             </w:r>
           </w:p>
         </w:tc>
         <w:tc>
           <w:tcPr>
-            <w:tcW w:type="dxa" w:w="3515"/>
+            <w:tcW w:type="dxa" w:w="1474"/>
           </w:tcPr>
           <w:p>
             <w:pPr>
@@ -242,15 +376,13 @@
               <w:rPr>
                 <w:sz w:val="20"/>
               </w:rPr>
-              <w:t>2021 原论文 Table 4</w:t>
+              <w:t>37.60%</w:t>
             </w:r>
           </w:p>
         </w:tc>
-      </w:tr>
-      <w:tr>
         <w:tc>
           <w:tcPr>
-            <w:tcW w:type="dxa" w:w="2948"/>
+            <w:tcW w:type="dxa" w:w="1474"/>
           </w:tcPr>
           <w:p>
             <w:pPr>
@@ -260,13 +392,13 @@
               <w:rPr>
                 <w:sz w:val="20"/>
               </w:rPr>
-              <w:t>PPL</w:t>
+              <w:t>94/250</w:t>
             </w:r>
           </w:p>
         </w:tc>
         <w:tc>
           <w:tcPr>
-            <w:tcW w:type="dxa" w:w="2948"/>
+            <w:tcW w:type="dxa" w:w="2665"/>
           </w:tcPr>
           <w:p>
             <w:pPr>
@@ -276,13 +408,15 @@
               <w:rPr>
                 <w:sz w:val="20"/>
               </w:rPr>
-              <w:t>18.61</w:t>
+              <w:t>baseline</w:t>
             </w:r>
           </w:p>
         </w:tc>
+      </w:tr>
+      <w:tr>
         <w:tc>
           <w:tcPr>
-            <w:tcW w:type="dxa" w:w="3515"/>
+            <w:tcW w:type="dxa" w:w="2381"/>
           </w:tcPr>
           <w:p>
             <w:pPr>
@@ -292,7 +426,439 @@
               <w:rPr>
                 <w:sz w:val="20"/>
               </w:rPr>
-              <w:t>作者后来在官方 README 中修正</w:t>
+              <w:t>DeepSeek V4-Pro</w:t>
+            </w:r>
+          </w:p>
+        </w:tc>
+        <w:tc>
+          <w:tcPr>
+            <w:tcW w:type="dxa" w:w="1474"/>
+          </w:tcPr>
+          <w:p>
+            <w:pPr>
+              <w:spacing w:after="0"/>
+            </w:pPr>
+            <w:r>
+              <w:rPr>
+                <w:sz w:val="20"/>
+              </w:rPr>
+              <w:t>fixed250</w:t>
+            </w:r>
+          </w:p>
+        </w:tc>
+        <w:tc>
+          <w:tcPr>
+            <w:tcW w:type="dxa" w:w="1474"/>
+          </w:tcPr>
+          <w:p>
+            <w:pPr>
+              <w:spacing w:after="0"/>
+            </w:pPr>
+            <w:r>
+              <w:rPr>
+                <w:sz w:val="20"/>
+              </w:rPr>
+              <w:t>14.80%</w:t>
+            </w:r>
+          </w:p>
+        </w:tc>
+        <w:tc>
+          <w:tcPr>
+            <w:tcW w:type="dxa" w:w="1474"/>
+          </w:tcPr>
+          <w:p>
+            <w:pPr>
+              <w:spacing w:after="0"/>
+            </w:pPr>
+            <w:r>
+              <w:rPr>
+                <w:sz w:val="20"/>
+              </w:rPr>
+              <w:t>37/250</w:t>
+            </w:r>
+          </w:p>
+        </w:tc>
+        <w:tc>
+          <w:tcPr>
+            <w:tcW w:type="dxa" w:w="2665"/>
+          </w:tcPr>
+          <w:p>
+            <w:pPr>
+              <w:spacing w:after="0"/>
+            </w:pPr>
+            <w:r>
+              <w:rPr>
+                <w:sz w:val="20"/>
+              </w:rPr>
+              <w:t>差 22.80 个百分点</w:t>
+            </w:r>
+          </w:p>
+        </w:tc>
+      </w:tr>
+      <w:tr>
+        <w:tc>
+          <w:tcPr>
+            <w:tcW w:type="dxa" w:w="2381"/>
+          </w:tcPr>
+          <w:p>
+            <w:pPr>
+              <w:spacing w:after="0"/>
+            </w:pPr>
+            <w:r>
+              <w:rPr>
+                <w:sz w:val="20"/>
+              </w:rPr>
+              <w:t>Qwen3.6-27B（未微调）</w:t>
+            </w:r>
+          </w:p>
+        </w:tc>
+        <w:tc>
+          <w:tcPr>
+            <w:tcW w:type="dxa" w:w="1474"/>
+          </w:tcPr>
+          <w:p>
+            <w:pPr>
+              <w:spacing w:after="0"/>
+            </w:pPr>
+            <w:r>
+              <w:rPr>
+                <w:sz w:val="20"/>
+              </w:rPr>
+              <w:t>fixed250</w:t>
+            </w:r>
+          </w:p>
+        </w:tc>
+        <w:tc>
+          <w:tcPr>
+            <w:tcW w:type="dxa" w:w="1474"/>
+          </w:tcPr>
+          <w:p>
+            <w:pPr>
+              <w:spacing w:after="0"/>
+            </w:pPr>
+            <w:r>
+              <w:rPr>
+                <w:sz w:val="20"/>
+              </w:rPr>
+              <w:t>14.00%</w:t>
+            </w:r>
+          </w:p>
+        </w:tc>
+        <w:tc>
+          <w:tcPr>
+            <w:tcW w:type="dxa" w:w="1474"/>
+          </w:tcPr>
+          <w:p>
+            <w:pPr>
+              <w:spacing w:after="0"/>
+            </w:pPr>
+            <w:r>
+              <w:rPr>
+                <w:sz w:val="20"/>
+              </w:rPr>
+              <w:t>35/250</w:t>
+            </w:r>
+          </w:p>
+        </w:tc>
+        <w:tc>
+          <w:tcPr>
+            <w:tcW w:type="dxa" w:w="2665"/>
+          </w:tcPr>
+          <w:p>
+            <w:pPr>
+              <w:spacing w:after="0"/>
+            </w:pPr>
+            <w:r>
+              <w:rPr>
+                <w:sz w:val="20"/>
+              </w:rPr>
+              <w:t>差 23.60 个百分点</w:t>
+            </w:r>
+          </w:p>
+        </w:tc>
+      </w:tr>
+    </w:tbl>
+    <w:p/>
+    <w:p>
+      <w:r>
+        <w:t>如果只机械地和 Causal-ESC 53.53%相减，DeepSeek 差 38.73 个百分点，Qwen 差 39.53 个百分点。因为协议不一致，这两个差值不能写成正式模型差距。</w:t>
+      </w:r>
+    </w:p>
+    <w:p>
+      <w:pPr>
+        <w:pStyle w:val="Heading1"/>
+      </w:pPr>
+      <w:r>
+        <w:t>3. 2021 原论文原本报告了什么</w:t>
+      </w:r>
+    </w:p>
+    <w:p>
+      <w:r>
+        <w:t>原论文是 Towards Emotional Support Dialog Systems（ACL 2021）。论文没有策略 Accuracy，公开的是回答生成指标和真人 A/B。</w:t>
+      </w:r>
+    </w:p>
+    <w:tbl>
+      <w:tblPr>
+        <w:tblStyle w:val="TableGrid"/>
+        <w:tblW w:type="auto" w:w="0"/>
+        <w:jc w:val="center"/>
+        <w:tblLayout w:type="fixed"/>
+        <w:tblLook w:firstColumn="1" w:firstRow="1" w:lastColumn="0" w:lastRow="0" w:noHBand="0" w:noVBand="1" w:val="04A0"/>
+      </w:tblPr>
+      <w:tblGrid>
+        <w:gridCol w:w="1949"/>
+        <w:gridCol w:w="1949"/>
+        <w:gridCol w:w="1949"/>
+        <w:gridCol w:w="1949"/>
+        <w:gridCol w:w="1949"/>
+      </w:tblGrid>
+      <w:tr>
+        <w:tc>
+          <w:tcPr>
+            <w:tcW w:type="dxa" w:w="3061"/>
+          </w:tcPr>
+          <w:p>
+            <w:pPr>
+              <w:spacing w:after="0"/>
+            </w:pPr>
+            <w:r>
+              <w:rPr>
+                <w:b/>
+                <w:sz w:val="20"/>
+              </w:rPr>
+              <w:t>模型</w:t>
+            </w:r>
+          </w:p>
+        </w:tc>
+        <w:tc>
+          <w:tcPr>
+            <w:tcW w:type="dxa" w:w="1701"/>
+          </w:tcPr>
+          <w:p>
+            <w:pPr>
+              <w:spacing w:after="0"/>
+            </w:pPr>
+            <w:r>
+              <w:rPr>
+                <w:b/>
+                <w:sz w:val="20"/>
+              </w:rPr>
+              <w:t>PPL</w:t>
+            </w:r>
+          </w:p>
+        </w:tc>
+        <w:tc>
+          <w:tcPr>
+            <w:tcW w:type="dxa" w:w="1531"/>
+          </w:tcPr>
+          <w:p>
+            <w:pPr>
+              <w:spacing w:after="0"/>
+            </w:pPr>
+            <w:r>
+              <w:rPr>
+                <w:b/>
+                <w:sz w:val="20"/>
+              </w:rPr>
+              <w:t>BLEU-2</w:t>
+            </w:r>
+          </w:p>
+        </w:tc>
+        <w:tc>
+          <w:tcPr>
+            <w:tcW w:type="dxa" w:w="1587"/>
+          </w:tcPr>
+          <w:p>
+            <w:pPr>
+              <w:spacing w:after="0"/>
+            </w:pPr>
+            <w:r>
+              <w:rPr>
+                <w:b/>
+                <w:sz w:val="20"/>
+              </w:rPr>
+              <w:t>ROUGE-L</w:t>
+            </w:r>
+          </w:p>
+        </w:tc>
+        <w:tc>
+          <w:tcPr>
+            <w:tcW w:type="dxa" w:w="1587"/>
+          </w:tcPr>
+          <w:p>
+            <w:pPr>
+              <w:spacing w:after="0"/>
+            </w:pPr>
+            <w:r>
+              <w:rPr>
+                <w:b/>
+                <w:sz w:val="20"/>
+              </w:rPr>
+              <w:t>Extrema</w:t>
+            </w:r>
+          </w:p>
+        </w:tc>
+      </w:tr>
+      <w:tr>
+        <w:tc>
+          <w:tcPr>
+            <w:tcW w:type="dxa" w:w="3061"/>
+          </w:tcPr>
+          <w:p>
+            <w:pPr>
+              <w:spacing w:after="0"/>
+            </w:pPr>
+            <w:r>
+              <w:rPr>
+                <w:sz w:val="20"/>
+              </w:rPr>
+              <w:t>BlenderBot Joint</w:t>
+            </w:r>
+          </w:p>
+        </w:tc>
+        <w:tc>
+          <w:tcPr>
+            <w:tcW w:type="dxa" w:w="1701"/>
+          </w:tcPr>
+          <w:p>
+            <w:pPr>
+              <w:spacing w:after="0"/>
+            </w:pPr>
+            <w:r>
+              <w:rPr>
+                <w:sz w:val="20"/>
+              </w:rPr>
+              <w:t>修正后 18.61</w:t>
+            </w:r>
+          </w:p>
+        </w:tc>
+        <w:tc>
+          <w:tcPr>
+            <w:tcW w:type="dxa" w:w="1531"/>
+          </w:tcPr>
+          <w:p>
+            <w:pPr>
+              <w:spacing w:after="0"/>
+            </w:pPr>
+            <w:r>
+              <w:rPr>
+                <w:sz w:val="20"/>
+              </w:rPr>
+              <w:t>5.35</w:t>
+            </w:r>
+          </w:p>
+        </w:tc>
+        <w:tc>
+          <w:tcPr>
+            <w:tcW w:type="dxa" w:w="1587"/>
+          </w:tcPr>
+          <w:p>
+            <w:pPr>
+              <w:spacing w:after="0"/>
+            </w:pPr>
+            <w:r>
+              <w:rPr>
+                <w:sz w:val="20"/>
+              </w:rPr>
+              <w:t>15.46</w:t>
+            </w:r>
+          </w:p>
+        </w:tc>
+        <w:tc>
+          <w:tcPr>
+            <w:tcW w:type="dxa" w:w="1587"/>
+          </w:tcPr>
+          <w:p>
+            <w:pPr>
+              <w:spacing w:after="0"/>
+            </w:pPr>
+            <w:r>
+              <w:rPr>
+                <w:sz w:val="20"/>
+              </w:rPr>
+              <w:t>50.27</w:t>
+            </w:r>
+          </w:p>
+        </w:tc>
+      </w:tr>
+      <w:tr>
+        <w:tc>
+          <w:tcPr>
+            <w:tcW w:type="dxa" w:w="3061"/>
+          </w:tcPr>
+          <w:p>
+            <w:pPr>
+              <w:spacing w:after="0"/>
+            </w:pPr>
+            <w:r>
+              <w:rPr>
+                <w:sz w:val="20"/>
+              </w:rPr>
+              <w:t>BlenderBot Oracle（真实策略）</w:t>
+            </w:r>
+          </w:p>
+        </w:tc>
+        <w:tc>
+          <w:tcPr>
+            <w:tcW w:type="dxa" w:w="1701"/>
+          </w:tcPr>
+          <w:p>
+            <w:pPr>
+              <w:spacing w:after="0"/>
+            </w:pPr>
+            <w:r>
+              <w:rPr>
+                <w:sz w:val="20"/>
+              </w:rPr>
+              <w:t>修正后 18.61</w:t>
+            </w:r>
+          </w:p>
+        </w:tc>
+        <w:tc>
+          <w:tcPr>
+            <w:tcW w:type="dxa" w:w="1531"/>
+          </w:tcPr>
+          <w:p>
+            <w:pPr>
+              <w:spacing w:after="0"/>
+            </w:pPr>
+            <w:r>
+              <w:rPr>
+                <w:sz w:val="20"/>
+              </w:rPr>
+              <w:t>6.31</w:t>
+            </w:r>
+          </w:p>
+        </w:tc>
+        <w:tc>
+          <w:tcPr>
+            <w:tcW w:type="dxa" w:w="1587"/>
+          </w:tcPr>
+          <w:p>
+            <w:pPr>
+              <w:spacing w:after="0"/>
+            </w:pPr>
+            <w:r>
+              <w:rPr>
+                <w:sz w:val="20"/>
+              </w:rPr>
+              <w:t>17.90</w:t>
+            </w:r>
+          </w:p>
+        </w:tc>
+        <w:tc>
+          <w:tcPr>
+            <w:tcW w:type="dxa" w:w="1587"/>
+          </w:tcPr>
+          <w:p>
+            <w:pPr>
+              <w:spacing w:after="0"/>
+            </w:pPr>
+            <w:r>
+              <w:rPr>
+                <w:sz w:val="20"/>
+              </w:rPr>
+              <w:t>51.65</w:t>
             </w:r>
           </w:p>
         </w:tc>
@@ -301,10 +867,65 @@
     <w:p/>
     <w:p>
       <w:pPr>
-        <w:ind w:left="283" w:right="283"/>
+        <w:pStyle w:val="ListBullet"/>
+        <w:ind w:left="340" w:hanging="170"/>
       </w:pPr>
       <w:r>
-        <w:t>必须说明：2021 原论文没有发表“策略 Accuracy”。19.60% 和 20.40% 是我们使用作者官方权重、官方数据和 Joint 的首策略 token 方法复算出来的数字。原论文真正公开的是 BLEU、ROUGE-L、Extrema、PPL 和真人 A/B。</w:t>
+        <w:t>Joint：先预测策略 token，再根据策略生成回复；本项目用它作为历史 baseline。</w:t>
+      </w:r>
+    </w:p>
+    <w:p>
+      <w:pPr>
+        <w:pStyle w:val="ListBullet"/>
+        <w:ind w:left="340" w:hanging="170"/>
+      </w:pPr>
+      <w:r>
+        <w:t>Oracle：直接给真实策略，只代表策略正确时的生成上限，不作为 baseline。</w:t>
+      </w:r>
+    </w:p>
+    <w:p>
+      <w:pPr>
+        <w:pStyle w:val="ListBullet"/>
+        <w:ind w:left="340" w:hanging="170"/>
+      </w:pPr>
+      <w:r>
+        <w:t>数据按对话做 6:2:2 划分。</w:t>
+      </w:r>
+    </w:p>
+    <w:p>
+      <w:pPr>
+        <w:pStyle w:val="ListBullet"/>
+        <w:ind w:left="340" w:hanging="170"/>
+      </w:pPr>
+      <w:r>
+        <w:t>每个训练片段使用目标 supporter 回复及之前 4 条 utterance。</w:t>
+      </w:r>
+    </w:p>
+    <w:p>
+      <w:pPr>
+        <w:pStyle w:val="ListBullet"/>
+        <w:ind w:left="340" w:hanging="170"/>
+      </w:pPr>
+      <w:r>
+        <w:t>BlenderBot-small 90M；学习率 5e-5；训练 5 epochs。</w:t>
+      </w:r>
+    </w:p>
+    <w:p>
+      <w:pPr>
+        <w:pStyle w:val="ListBullet"/>
+        <w:ind w:left="340" w:hanging="170"/>
+      </w:pPr>
+      <w:r>
+        <w:t>按验证集 PPL 选择 checkpoint。</w:t>
+      </w:r>
+    </w:p>
+    <w:p>
+      <w:pPr>
+        <w:pStyle w:val="ListBullet"/>
+        <w:ind w:left="340" w:hanging="170"/>
+      </w:pPr>
+      <w:r>
+        <w:t>生成参数为 top-p 0.9、top-k 30、temperature 0.7。</w:t>
       </w:r>
     </w:p>
     <w:p>
@@ -312,12 +933,12 @@
         <w:pStyle w:val="Heading1"/>
       </w:pPr>
       <w:r>
-        <w:t>2. 现在三个模型的准确率</w:t>
+        <w:t>4. 改善 ESConv 的后续论文</w:t>
       </w:r>
     </w:p>
     <w:p>
       <w:r>
-        <w:t>公平比较先看相同的前 250 条。</w:t>
+        <w:t>下列结果都是 paper-reported、protocol-specific。数据版本、标签处理和切分并不完全一致，不能拼成严格排行榜。</w:t>
       </w:r>
     </w:p>
     <w:tbl>
@@ -337,458 +958,12 @@
       <w:tr>
         <w:tc>
           <w:tcPr>
-            <w:tcW w:type="dxa" w:w="2835"/>
-          </w:tcPr>
-          <w:p>
-            <w:r>
-              <w:rPr>
-                <w:b/>
-                <w:sz w:val="20"/>
-              </w:rPr>
-              <w:t>模型</w:t>
-            </w:r>
-          </w:p>
-        </w:tc>
-        <w:tc>
-          <w:tcPr>
-            <w:tcW w:type="dxa" w:w="1701"/>
-          </w:tcPr>
-          <w:p>
-            <w:r>
-              <w:rPr>
-                <w:b/>
-                <w:sz w:val="20"/>
-              </w:rPr>
-              <w:t>Accuracy</w:t>
-            </w:r>
-          </w:p>
-        </w:tc>
-        <w:tc>
-          <w:tcPr>
-            <w:tcW w:type="dxa" w:w="1701"/>
-          </w:tcPr>
-          <w:p>
-            <w:r>
-              <w:rPr>
-                <w:b/>
-                <w:sz w:val="20"/>
-              </w:rPr>
-              <w:t>正确数</w:t>
-            </w:r>
-          </w:p>
-        </w:tc>
-        <w:tc>
-          <w:tcPr>
-            <w:tcW w:type="dxa" w:w="3175"/>
-          </w:tcPr>
-          <w:p>
-            <w:r>
-              <w:rPr>
-                <w:b/>
-                <w:sz w:val="20"/>
-              </w:rPr>
-              <w:t>距离 2021 baseline 20.40%</w:t>
-            </w:r>
-          </w:p>
-        </w:tc>
-      </w:tr>
-      <w:tr>
-        <w:tc>
-          <w:tcPr>
-            <w:tcW w:type="dxa" w:w="2835"/>
+            <w:tcW w:type="dxa" w:w="1871"/>
           </w:tcPr>
           <w:p>
             <w:pPr>
               <w:spacing w:after="0"/>
             </w:pPr>
-            <w:r>
-              <w:rPr>
-                <w:sz w:val="20"/>
-              </w:rPr>
-              <w:t>2021 ESC Blender Joint</w:t>
-            </w:r>
-          </w:p>
-        </w:tc>
-        <w:tc>
-          <w:tcPr>
-            <w:tcW w:type="dxa" w:w="1701"/>
-          </w:tcPr>
-          <w:p>
-            <w:pPr>
-              <w:spacing w:after="0"/>
-            </w:pPr>
-            <w:r>
-              <w:rPr>
-                <w:sz w:val="20"/>
-              </w:rPr>
-              <w:t>20.40%</w:t>
-            </w:r>
-          </w:p>
-        </w:tc>
-        <w:tc>
-          <w:tcPr>
-            <w:tcW w:type="dxa" w:w="1701"/>
-          </w:tcPr>
-          <w:p>
-            <w:pPr>
-              <w:spacing w:after="0"/>
-            </w:pPr>
-            <w:r>
-              <w:rPr>
-                <w:sz w:val="20"/>
-              </w:rPr>
-              <w:t>51/250</w:t>
-            </w:r>
-          </w:p>
-        </w:tc>
-        <w:tc>
-          <w:tcPr>
-            <w:tcW w:type="dxa" w:w="3175"/>
-          </w:tcPr>
-          <w:p>
-            <w:pPr>
-              <w:spacing w:after="0"/>
-            </w:pPr>
-            <w:r>
-              <w:rPr>
-                <w:sz w:val="20"/>
-              </w:rPr>
-              <w:t>baseline</w:t>
-            </w:r>
-          </w:p>
-        </w:tc>
-      </w:tr>
-      <w:tr>
-        <w:tc>
-          <w:tcPr>
-            <w:tcW w:type="dxa" w:w="2835"/>
-          </w:tcPr>
-          <w:p>
-            <w:pPr>
-              <w:spacing w:after="0"/>
-            </w:pPr>
-            <w:r>
-              <w:rPr>
-                <w:sz w:val="20"/>
-              </w:rPr>
-              <w:t>DeepSeek V4-Pro</w:t>
-            </w:r>
-          </w:p>
-        </w:tc>
-        <w:tc>
-          <w:tcPr>
-            <w:tcW w:type="dxa" w:w="1701"/>
-          </w:tcPr>
-          <w:p>
-            <w:pPr>
-              <w:spacing w:after="0"/>
-            </w:pPr>
-            <w:r>
-              <w:rPr>
-                <w:sz w:val="20"/>
-              </w:rPr>
-              <w:t>14.80%</w:t>
-            </w:r>
-          </w:p>
-        </w:tc>
-        <w:tc>
-          <w:tcPr>
-            <w:tcW w:type="dxa" w:w="1701"/>
-          </w:tcPr>
-          <w:p>
-            <w:pPr>
-              <w:spacing w:after="0"/>
-            </w:pPr>
-            <w:r>
-              <w:rPr>
-                <w:sz w:val="20"/>
-              </w:rPr>
-              <w:t>37/250</w:t>
-            </w:r>
-          </w:p>
-        </w:tc>
-        <w:tc>
-          <w:tcPr>
-            <w:tcW w:type="dxa" w:w="3175"/>
-          </w:tcPr>
-          <w:p>
-            <w:pPr>
-              <w:spacing w:after="0"/>
-            </w:pPr>
-            <w:r>
-              <w:rPr>
-                <w:sz w:val="20"/>
-              </w:rPr>
-              <w:t>差 5.60 个百分点</w:t>
-            </w:r>
-          </w:p>
-        </w:tc>
-      </w:tr>
-      <w:tr>
-        <w:tc>
-          <w:tcPr>
-            <w:tcW w:type="dxa" w:w="2835"/>
-          </w:tcPr>
-          <w:p>
-            <w:pPr>
-              <w:spacing w:after="0"/>
-            </w:pPr>
-            <w:r>
-              <w:rPr>
-                <w:sz w:val="20"/>
-              </w:rPr>
-              <w:t>Qwen3.6-27B（未微调）</w:t>
-            </w:r>
-          </w:p>
-        </w:tc>
-        <w:tc>
-          <w:tcPr>
-            <w:tcW w:type="dxa" w:w="1701"/>
-          </w:tcPr>
-          <w:p>
-            <w:pPr>
-              <w:spacing w:after="0"/>
-            </w:pPr>
-            <w:r>
-              <w:rPr>
-                <w:sz w:val="20"/>
-              </w:rPr>
-              <w:t>14.00%</w:t>
-            </w:r>
-          </w:p>
-        </w:tc>
-        <w:tc>
-          <w:tcPr>
-            <w:tcW w:type="dxa" w:w="1701"/>
-          </w:tcPr>
-          <w:p>
-            <w:pPr>
-              <w:spacing w:after="0"/>
-            </w:pPr>
-            <w:r>
-              <w:rPr>
-                <w:sz w:val="20"/>
-              </w:rPr>
-              <w:t>35/250</w:t>
-            </w:r>
-          </w:p>
-        </w:tc>
-        <w:tc>
-          <w:tcPr>
-            <w:tcW w:type="dxa" w:w="3175"/>
-          </w:tcPr>
-          <w:p>
-            <w:pPr>
-              <w:spacing w:after="0"/>
-            </w:pPr>
-            <w:r>
-              <w:rPr>
-                <w:sz w:val="20"/>
-              </w:rPr>
-              <w:t>差 6.40 个百分点</w:t>
-            </w:r>
-          </w:p>
-        </w:tc>
-      </w:tr>
-    </w:tbl>
-    <w:p/>
-    <w:p>
-      <w:r>
-        <w:t>因此，现在不是差 39.53 个百分点。把 2021 原论文模型设为 baseline 后：</w:t>
-      </w:r>
-    </w:p>
-    <w:p>
-      <w:pPr>
-        <w:pStyle w:val="ListBullet"/>
-        <w:ind w:left="340" w:hanging="170"/>
-      </w:pPr>
-      <w:r>
-        <w:t>DeepSeek V4-Pro 还差 5.60 个百分点。</w:t>
-      </w:r>
-    </w:p>
-    <w:p>
-      <w:pPr>
-        <w:pStyle w:val="ListBullet"/>
-        <w:ind w:left="340" w:hanging="170"/>
-      </w:pPr>
-      <w:r>
-        <w:t>未微调 Qwen3.6-27B 还差 6.40 个百分点。</w:t>
-      </w:r>
-    </w:p>
-    <w:p>
-      <w:pPr>
-        <w:pStyle w:val="Heading1"/>
-      </w:pPr>
-      <w:r>
-        <w:t>3. 2021 原论文的方法</w:t>
-      </w:r>
-    </w:p>
-    <w:p>
-      <w:pPr>
-        <w:pStyle w:val="ListBullet"/>
-        <w:ind w:left="340" w:hanging="170"/>
-      </w:pPr>
-      <w:r>
-        <w:t>骨干模型：BlenderBot-small 90M 和 DialoGPT-small。</w:t>
-      </w:r>
-    </w:p>
-    <w:p>
-      <w:pPr>
-        <w:pStyle w:val="ListBullet"/>
-        <w:ind w:left="340" w:hanging="170"/>
-      </w:pPr>
-      <w:r>
-        <w:t>Vanilla：直接在 ESConv 上微调，不使用策略标签。</w:t>
-      </w:r>
-    </w:p>
-    <w:p>
-      <w:pPr>
-        <w:pStyle w:val="ListBullet"/>
-        <w:ind w:left="340" w:hanging="170"/>
-      </w:pPr>
-      <w:r>
-        <w:t>Joint：先预测一个支持策略 token，再根据策略生成回答。我们把 Joint 作为 baseline。</w:t>
-      </w:r>
-    </w:p>
-    <w:p>
-      <w:pPr>
-        <w:pStyle w:val="ListBullet"/>
-        <w:ind w:left="340" w:hanging="170"/>
-      </w:pPr>
-      <w:r>
-        <w:t>Oracle：直接给模型真实策略，只表示策略正确时的生成上限，不作为 baseline。</w:t>
-      </w:r>
-    </w:p>
-    <w:p>
-      <w:pPr>
-        <w:pStyle w:val="ListBullet"/>
-        <w:ind w:left="340" w:hanging="170"/>
-      </w:pPr>
-      <w:r>
-        <w:t>按对话做 6:2:2 的训练、验证、测试切分。</w:t>
-      </w:r>
-    </w:p>
-    <w:p>
-      <w:pPr>
-        <w:pStyle w:val="ListBullet"/>
-        <w:ind w:left="340" w:hanging="170"/>
-      </w:pPr>
-      <w:r>
-        <w:t>每个训练片段包含目标 supporter 回答及前 4 个 utterances。</w:t>
-      </w:r>
-    </w:p>
-    <w:p>
-      <w:pPr>
-        <w:pStyle w:val="ListBullet"/>
-        <w:ind w:left="340" w:hanging="170"/>
-      </w:pPr>
-      <w:r>
-        <w:t>Adam，学习率 5e-5，训练 5 epochs，选验证集 PPL 最低的 checkpoint。</w:t>
-      </w:r>
-    </w:p>
-    <w:p>
-      <w:pPr>
-        <w:pStyle w:val="ListBullet"/>
-        <w:ind w:left="340" w:hanging="170"/>
-      </w:pPr>
-      <w:r>
-        <w:t>生成参数：top-p 0.9、top-k 30、temperature 0.7。</w:t>
-      </w:r>
-    </w:p>
-    <w:p>
-      <w:pPr>
-        <w:pStyle w:val="Heading1"/>
-      </w:pPr>
-      <w:r>
-        <w:t>4. 我们按原方法跑了什么</w:t>
-      </w:r>
-    </w:p>
-    <w:p>
-      <w:pPr>
-        <w:pStyle w:val="ListBullet"/>
-        <w:ind w:left="340" w:hanging="170"/>
-      </w:pPr>
-      <w:r>
-        <w:t>下载作者发布的 ESC_Blender_Strategy 权重。</w:t>
-      </w:r>
-    </w:p>
-    <w:p>
-      <w:pPr>
-        <w:pStyle w:val="ListBullet"/>
-        <w:ind w:left="340" w:hanging="170"/>
-      </w:pPr>
-      <w:r>
-        <w:t>使用 2021 年原始固定测试文件，共 2,775 个 supporter 回答样本。</w:t>
-      </w:r>
-    </w:p>
-    <w:p>
-      <w:pPr>
-        <w:pStyle w:val="ListBullet"/>
-        <w:ind w:left="340" w:hanging="170"/>
-      </w:pPr>
-      <w:r>
-        <w:t>读取 decoder 第一步在 8 个策略 token 上的分数，使用 top-1 作为预测策略。</w:t>
-      </w:r>
-    </w:p>
-    <w:p>
-      <w:pPr>
-        <w:pStyle w:val="ListBullet"/>
-        <w:ind w:left="340" w:hanging="170"/>
-      </w:pPr>
-      <w:r>
-        <w:t>全量结果：Accuracy 19.60%，Macro-F1 13.86%，Weighted-F1 17.53%。</w:t>
-      </w:r>
-    </w:p>
-    <w:p>
-      <w:pPr>
-        <w:pStyle w:val="ListBullet"/>
-        <w:ind w:left="340" w:hanging="170"/>
-      </w:pPr>
-      <w:r>
-        <w:t>前 250 条结果：Accuracy 20.40%，Macro-F1 12.89%，Weighted-F1 18.37%。</w:t>
-      </w:r>
-    </w:p>
-    <w:p>
-      <w:pPr>
-        <w:pStyle w:val="ListBullet"/>
-        <w:ind w:left="340" w:hanging="170"/>
-      </w:pPr>
-      <w:r>
-        <w:t>这次是作者官方权重的评测复现，不是从随机权重重新训练 5 epochs。</w:t>
-      </w:r>
-    </w:p>
-    <w:p>
-      <w:pPr>
-        <w:pStyle w:val="Heading1"/>
-      </w:pPr>
-      <w:r>
-        <w:t>5. 后续改善 ESConv 的论文</w:t>
-      </w:r>
-    </w:p>
-    <w:p>
-      <w:r>
-        <w:t>这些论文保留为“后续方法参考”，不再叫 baseline。</w:t>
-      </w:r>
-    </w:p>
-    <w:tbl>
-      <w:tblPr>
-        <w:tblStyle w:val="TableGrid"/>
-        <w:tblW w:type="auto" w:w="0"/>
-        <w:jc w:val="center"/>
-        <w:tblLayout w:type="fixed"/>
-        <w:tblLook w:firstColumn="1" w:firstRow="1" w:lastColumn="0" w:lastRow="0" w:noHBand="0" w:noVBand="1" w:val="04A0"/>
-      </w:tblPr>
-      <w:tblGrid>
-        <w:gridCol w:w="3249"/>
-        <w:gridCol w:w="3249"/>
-        <w:gridCol w:w="3249"/>
-      </w:tblGrid>
-      <w:tr>
-        <w:tc>
-          <w:tcPr>
-            <w:tcW w:type="dxa" w:w="2098"/>
-          </w:tcPr>
-          <w:p>
             <w:r>
               <w:rPr>
                 <w:b/>
@@ -800,29 +975,52 @@
         </w:tc>
         <w:tc>
           <w:tcPr>
-            <w:tcW w:type="dxa" w:w="4535"/>
+            <w:tcW w:type="dxa" w:w="907"/>
           </w:tcPr>
           <w:p>
+            <w:pPr>
+              <w:spacing w:after="0"/>
+            </w:pPr>
             <w:r>
               <w:rPr>
                 <w:b/>
                 <w:sz w:val="20"/>
               </w:rPr>
-              <w:t>方法</w:t>
+              <w:t>年份</w:t>
             </w:r>
           </w:p>
         </w:tc>
         <w:tc>
           <w:tcPr>
-            <w:tcW w:type="dxa" w:w="3005"/>
+            <w:tcW w:type="dxa" w:w="4252"/>
           </w:tcPr>
           <w:p>
+            <w:pPr>
+              <w:spacing w:after="0"/>
+            </w:pPr>
             <w:r>
               <w:rPr>
                 <w:b/>
                 <w:sz w:val="20"/>
               </w:rPr>
-              <w:t>结果</w:t>
+              <w:t>主要方法</w:t>
+            </w:r>
+          </w:p>
+        </w:tc>
+        <w:tc>
+          <w:tcPr>
+            <w:tcW w:type="dxa" w:w="2608"/>
+          </w:tcPr>
+          <w:p>
+            <w:pPr>
+              <w:spacing w:after="0"/>
+            </w:pPr>
+            <w:r>
+              <w:rPr>
+                <w:b/>
+                <w:sz w:val="20"/>
+              </w:rPr>
+              <w:t>论文结果</w:t>
             </w:r>
           </w:p>
         </w:tc>
@@ -830,7 +1028,7 @@
       <w:tr>
         <w:tc>
           <w:tcPr>
-            <w:tcW w:type="dxa" w:w="2098"/>
+            <w:tcW w:type="dxa" w:w="1871"/>
           </w:tcPr>
           <w:p>
             <w:pPr>
@@ -840,13 +1038,13 @@
               <w:rPr>
                 <w:sz w:val="20"/>
               </w:rPr>
-              <w:t>MISC（2022）</w:t>
+              <w:t>Causal-ESC</w:t>
             </w:r>
           </w:p>
         </w:tc>
         <w:tc>
           <w:tcPr>
-            <w:tcW w:type="dxa" w:w="4535"/>
+            <w:tcW w:type="dxa" w:w="907"/>
           </w:tcPr>
           <w:p>
             <w:pPr>
@@ -856,13 +1054,13 @@
               <w:rPr>
                 <w:sz w:val="20"/>
               </w:rPr>
-              <w:t>常识增强、混合策略感知</w:t>
+              <w:t>2026</w:t>
             </w:r>
           </w:p>
         </w:tc>
         <w:tc>
           <w:tcPr>
-            <w:tcW w:type="dxa" w:w="3005"/>
+            <w:tcW w:type="dxa" w:w="4252"/>
           </w:tcPr>
           <w:p>
             <w:pPr>
@@ -872,15 +1070,13 @@
               <w:rPr>
                 <w:sz w:val="20"/>
               </w:rPr>
-              <w:t>Accuracy 31.61%</w:t>
+              <w:t>Doubly Robust 因果策略学习，之后用 LLM 做风格重写</w:t>
             </w:r>
           </w:p>
         </w:tc>
-      </w:tr>
-      <w:tr>
         <w:tc>
           <w:tcPr>
-            <w:tcW w:type="dxa" w:w="2098"/>
+            <w:tcW w:type="dxa" w:w="2608"/>
           </w:tcPr>
           <w:p>
             <w:pPr>
@@ -890,13 +1086,15 @@
               <w:rPr>
                 <w:sz w:val="20"/>
               </w:rPr>
-              <w:t>KEMP（2022）</w:t>
+              <w:t>Accuracy 53.53%</w:t>
             </w:r>
           </w:p>
         </w:tc>
+      </w:tr>
+      <w:tr>
         <w:tc>
           <w:tcPr>
-            <w:tcW w:type="dxa" w:w="4535"/>
+            <w:tcW w:type="dxa" w:w="1871"/>
           </w:tcPr>
           <w:p>
             <w:pPr>
@@ -906,13 +1104,13 @@
               <w:rPr>
                 <w:sz w:val="20"/>
               </w:rPr>
-              <w:t>ConceptNet 外部知识、情绪依赖建模</w:t>
+              <w:t>SAGE</w:t>
             </w:r>
           </w:p>
         </w:tc>
         <w:tc>
           <w:tcPr>
-            <w:tcW w:type="dxa" w:w="3005"/>
+            <w:tcW w:type="dxa" w:w="907"/>
           </w:tcPr>
           <w:p>
             <w:pPr>
@@ -922,15 +1120,13 @@
               <w:rPr>
                 <w:sz w:val="20"/>
               </w:rPr>
-              <w:t>Accuracy 39.31%</w:t>
+              <w:t>2026</w:t>
             </w:r>
           </w:p>
         </w:tc>
-      </w:tr>
-      <w:tr>
         <w:tc>
           <w:tcPr>
-            <w:tcW w:type="dxa" w:w="2098"/>
+            <w:tcW w:type="dxa" w:w="4252"/>
           </w:tcPr>
           <w:p>
             <w:pPr>
@@ -940,13 +1136,13 @@
               <w:rPr>
                 <w:sz w:val="20"/>
               </w:rPr>
-              <w:t>MultiESC（2022）</w:t>
+              <w:t>自检索、层级 ResID、策略约束解码、COMET/HEAL 重排</w:t>
             </w:r>
           </w:p>
         </w:tc>
         <w:tc>
           <w:tcPr>
-            <w:tcW w:type="dxa" w:w="4535"/>
+            <w:tcW w:type="dxa" w:w="2608"/>
           </w:tcPr>
           <w:p>
             <w:pPr>
@@ -956,13 +1152,15 @@
               <w:rPr>
                 <w:sz w:val="20"/>
               </w:rPr>
-              <w:t>多轮上下文、前瞻式策略规划</w:t>
+              <w:t>Accuracy 46.8%；Macro-F1 38.95%</w:t>
             </w:r>
           </w:p>
         </w:tc>
+      </w:tr>
+      <w:tr>
         <w:tc>
           <w:tcPr>
-            <w:tcW w:type="dxa" w:w="3005"/>
+            <w:tcW w:type="dxa" w:w="1871"/>
           </w:tcPr>
           <w:p>
             <w:pPr>
@@ -972,15 +1170,13 @@
               <w:rPr>
                 <w:sz w:val="20"/>
               </w:rPr>
-              <w:t>Accuracy 42.01%</w:t>
+              <w:t>DPPLM</w:t>
             </w:r>
           </w:p>
         </w:tc>
-      </w:tr>
-      <w:tr>
         <w:tc>
           <w:tcPr>
-            <w:tcW w:type="dxa" w:w="2098"/>
+            <w:tcW w:type="dxa" w:w="907"/>
           </w:tcPr>
           <w:p>
             <w:pPr>
@@ -990,13 +1186,13 @@
               <w:rPr>
                 <w:sz w:val="20"/>
               </w:rPr>
-              <w:t>GREEN（2025）</w:t>
+              <w:t>2025</w:t>
             </w:r>
           </w:p>
         </w:tc>
         <w:tc>
           <w:tcPr>
-            <w:tcW w:type="dxa" w:w="4535"/>
+            <w:tcW w:type="dxa" w:w="4252"/>
           </w:tcPr>
           <w:p>
             <w:pPr>
@@ -1006,63 +1202,13 @@
               <w:rPr>
                 <w:sz w:val="20"/>
               </w:rPr>
-              <w:t>生成式检索、ResID 上下文分析</w:t>
+              <w:t>情绪原因蕴含，动态控制策略和共情</w:t>
             </w:r>
           </w:p>
         </w:tc>
         <w:tc>
           <w:tcPr>
-            <w:tcW w:type="dxa" w:w="3005"/>
-          </w:tcPr>
-          <w:p>
-            <w:pPr>
-              <w:spacing w:after="0"/>
-            </w:pPr>
-            <w:r>
-              <w:rPr>
-                <w:sz w:val="20"/>
-              </w:rPr>
-              <w:t>策略预测提升 9.8%，绝对值未核实</w:t>
-            </w:r>
-          </w:p>
-        </w:tc>
-      </w:tr>
-      <w:tr>
-        <w:tc>
-          <w:tcPr>
-            <w:tcW w:type="dxa" w:w="2098"/>
-          </w:tcPr>
-          <w:p>
-            <w:pPr>
-              <w:spacing w:after="0"/>
-            </w:pPr>
-            <w:r>
-              <w:rPr>
-                <w:sz w:val="20"/>
-              </w:rPr>
-              <w:t>DPPLM（2025/26）</w:t>
-            </w:r>
-          </w:p>
-        </w:tc>
-        <w:tc>
-          <w:tcPr>
-            <w:tcW w:type="dxa" w:w="4535"/>
-          </w:tcPr>
-          <w:p>
-            <w:pPr>
-              <w:spacing w:after="0"/>
-            </w:pPr>
-            <w:r>
-              <w:rPr>
-                <w:sz w:val="20"/>
-              </w:rPr>
-              <w:t>情绪原因蕴含、动态策略与共情控制</w:t>
-            </w:r>
-          </w:p>
-        </w:tc>
-        <w:tc>
-          <w:tcPr>
-            <w:tcW w:type="dxa" w:w="3005"/>
+            <w:tcW w:type="dxa" w:w="2608"/>
           </w:tcPr>
           <w:p>
             <w:pPr>
@@ -1080,7 +1226,7 @@
       <w:tr>
         <w:tc>
           <w:tcPr>
-            <w:tcW w:type="dxa" w:w="2098"/>
+            <w:tcW w:type="dxa" w:w="1871"/>
           </w:tcPr>
           <w:p>
             <w:pPr>
@@ -1090,13 +1236,13 @@
               <w:rPr>
                 <w:sz w:val="20"/>
               </w:rPr>
-              <w:t>Causal-ESC（2026）</w:t>
+              <w:t>GREEN</w:t>
             </w:r>
           </w:p>
         </w:tc>
         <w:tc>
           <w:tcPr>
-            <w:tcW w:type="dxa" w:w="4535"/>
+            <w:tcW w:type="dxa" w:w="907"/>
           </w:tcPr>
           <w:p>
             <w:pPr>
@@ -1106,13 +1252,13 @@
               <w:rPr>
                 <w:sz w:val="20"/>
               </w:rPr>
-              <w:t>Doubly Robust 因果策略学习</w:t>
+              <w:t>2025</w:t>
             </w:r>
           </w:p>
         </w:tc>
         <w:tc>
           <w:tcPr>
-            <w:tcW w:type="dxa" w:w="3005"/>
+            <w:tcW w:type="dxa" w:w="4252"/>
           </w:tcPr>
           <w:p>
             <w:pPr>
@@ -1122,15 +1268,13 @@
               <w:rPr>
                 <w:sz w:val="20"/>
               </w:rPr>
-              <w:t>Accuracy 53.53%</w:t>
+              <w:t>生成式检索、ResID 上下文识别</w:t>
             </w:r>
           </w:p>
         </w:tc>
-      </w:tr>
-      <w:tr>
         <w:tc>
           <w:tcPr>
-            <w:tcW w:type="dxa" w:w="2098"/>
+            <w:tcW w:type="dxa" w:w="2608"/>
           </w:tcPr>
           <w:p>
             <w:pPr>
@@ -1140,13 +1284,15 @@
               <w:rPr>
                 <w:sz w:val="20"/>
               </w:rPr>
-              <w:t>SAGE（2026）</w:t>
+              <w:t>Accuracy 38.8%</w:t>
             </w:r>
           </w:p>
         </w:tc>
+      </w:tr>
+      <w:tr>
         <w:tc>
           <w:tcPr>
-            <w:tcW w:type="dxa" w:w="4535"/>
+            <w:tcW w:type="dxa" w:w="1871"/>
           </w:tcPr>
           <w:p>
             <w:pPr>
@@ -1156,13 +1302,13 @@
               <w:rPr>
                 <w:sz w:val="20"/>
               </w:rPr>
-              <w:t>自检索、策略约束解码、COMET/HEAL 重排</w:t>
+              <w:t>EmoDynamiX</w:t>
             </w:r>
           </w:p>
         </w:tc>
         <w:tc>
           <w:tcPr>
-            <w:tcW w:type="dxa" w:w="3005"/>
+            <w:tcW w:type="dxa" w:w="907"/>
           </w:tcPr>
           <w:p>
             <w:pPr>
@@ -1172,7 +1318,105 @@
               <w:rPr>
                 <w:sz w:val="20"/>
               </w:rPr>
-              <w:t>提升 13.4%，绝对值未公开</w:t>
+              <w:t>2025</w:t>
+            </w:r>
+          </w:p>
+        </w:tc>
+        <w:tc>
+          <w:tcPr>
+            <w:tcW w:type="dxa" w:w="4252"/>
+          </w:tcPr>
+          <w:p>
+            <w:pPr>
+              <w:spacing w:after="0"/>
+            </w:pPr>
+            <w:r>
+              <w:rPr>
+                <w:sz w:val="20"/>
+              </w:rPr>
+              <w:t>异构图建模细粒度混合情绪和话语策略动态</w:t>
+            </w:r>
+          </w:p>
+        </w:tc>
+        <w:tc>
+          <w:tcPr>
+            <w:tcW w:type="dxa" w:w="2608"/>
+          </w:tcPr>
+          <w:p>
+            <w:pPr>
+              <w:spacing w:after="0"/>
+            </w:pPr>
+            <w:r>
+              <w:rPr>
+                <w:sz w:val="20"/>
+              </w:rPr>
+              <w:t>主要报告 Macro/Weighted-F1，不混入本表排名</w:t>
+            </w:r>
+          </w:p>
+        </w:tc>
+      </w:tr>
+      <w:tr>
+        <w:tc>
+          <w:tcPr>
+            <w:tcW w:type="dxa" w:w="1871"/>
+          </w:tcPr>
+          <w:p>
+            <w:pPr>
+              <w:spacing w:after="0"/>
+            </w:pPr>
+            <w:r>
+              <w:rPr>
+                <w:sz w:val="20"/>
+              </w:rPr>
+              <w:t>MultiESC</w:t>
+            </w:r>
+          </w:p>
+        </w:tc>
+        <w:tc>
+          <w:tcPr>
+            <w:tcW w:type="dxa" w:w="907"/>
+          </w:tcPr>
+          <w:p>
+            <w:pPr>
+              <w:spacing w:after="0"/>
+            </w:pPr>
+            <w:r>
+              <w:rPr>
+                <w:sz w:val="20"/>
+              </w:rPr>
+              <w:t>2022</w:t>
+            </w:r>
+          </w:p>
+        </w:tc>
+        <w:tc>
+          <w:tcPr>
+            <w:tcW w:type="dxa" w:w="4252"/>
+          </w:tcPr>
+          <w:p>
+            <w:pPr>
+              <w:spacing w:after="0"/>
+            </w:pPr>
+            <w:r>
+              <w:rPr>
+                <w:sz w:val="20"/>
+              </w:rPr>
+              <w:t>多轮状态建模和前瞻式策略规划</w:t>
+            </w:r>
+          </w:p>
+        </w:tc>
+        <w:tc>
+          <w:tcPr>
+            <w:tcW w:type="dxa" w:w="2608"/>
+          </w:tcPr>
+          <w:p>
+            <w:pPr>
+              <w:spacing w:after="0"/>
+            </w:pPr>
+            <w:r>
+              <w:rPr>
+                <w:sz w:val="20"/>
+              </w:rPr>
+              <w:t>Accuracy 42.01%；Weighted-F1 34.01%</w:t>
             </w:r>
           </w:p>
         </w:tc>
@@ -1180,26 +1424,19 @@
     </w:tbl>
     <w:p/>
     <w:p>
+      <w:pPr>
+        <w:pStyle w:val="Heading1"/>
+      </w:pPr>
       <w:r>
-        <w:t>Next Stage Prediction 的 86.4% 不放进这张表，因为它预测对话阶段，不是 ESConv 的 8 类下一策略。</w:t>
+        <w:t>5. 每篇方法记要</w:t>
       </w:r>
     </w:p>
     <w:p>
       <w:pPr>
-        <w:pStyle w:val="Heading1"/>
+        <w:pStyle w:val="Heading2"/>
       </w:pPr>
       <w:r>
-        <w:t>6. 这个数据集还用不用</w:t>
-      </w:r>
-    </w:p>
-    <w:p>
-      <w:r>
-        <w:t>继续用，但只把它当作策略选择测试。它已经有五年历史，数据量小、英文众包、不能代表临床能力，也没有覆盖 RAG、联网和危险检测。它仍然适合做微调前后对照，因为标签固定、测试集公开、旧模型和新模型都能跑。</w:t>
-      </w:r>
-    </w:p>
-    <w:p>
-      <w:r>
-        <w:t>正式规则：</w:t>
+        <w:t>Causal-ESC</w:t>
       </w:r>
     </w:p>
     <w:p>
@@ -1208,7 +1445,7 @@
         <w:ind w:left="340" w:hanging="170"/>
       </w:pPr>
       <w:r>
-        <w:t>固定 ESConv 2021 原始 1,053 对话版本。</w:t>
+        <w:t>把策略选择当作离线策略学习问题。</w:t>
       </w:r>
     </w:p>
     <w:p>
@@ -1217,7 +1454,7 @@
         <w:ind w:left="340" w:hanging="170"/>
       </w:pPr>
       <w:r>
-        <w:t>固定官方 test 和 8 类策略标签。</w:t>
+        <w:t>同时估计 outcome model 和 propensity model。</w:t>
       </w:r>
     </w:p>
     <w:p>
@@ -1226,7 +1463,7 @@
         <w:ind w:left="340" w:hanging="170"/>
       </w:pPr>
       <w:r>
-        <w:t>主指标报 Accuracy、Macro-F1、Weighted-F1、无效输出率和混淆矩阵。</w:t>
+        <w:t>使用 Doubly Robust 估计降低观察数据里的策略选择偏差。</w:t>
       </w:r>
     </w:p>
     <w:p>
@@ -1235,7 +1472,191 @@
         <w:ind w:left="340" w:hanging="170"/>
       </w:pPr>
       <w:r>
-        <w:t>论文对比使用 MODEL_ONLY。完整静室流程单独报告，不混成一个分数。</w:t>
+        <w:t>策略选定后再让 LLM 把结果改写成自然回答。</w:t>
+      </w:r>
+    </w:p>
+    <w:p>
+      <w:pPr>
+        <w:pStyle w:val="Heading2"/>
+      </w:pPr>
+      <w:r>
+        <w:t>SAGE</w:t>
+      </w:r>
+    </w:p>
+    <w:p>
+      <w:pPr>
+        <w:pStyle w:val="ListBullet"/>
+        <w:ind w:left="340" w:hanging="170"/>
+      </w:pPr>
+      <w:r>
+        <w:t>把回答、策略、情绪和上下文编码成层级 ResID。</w:t>
+      </w:r>
+    </w:p>
+    <w:p>
+      <w:pPr>
+        <w:pStyle w:val="ListBullet"/>
+        <w:ind w:left="340" w:hanging="170"/>
+      </w:pPr>
+      <w:r>
+        <w:t>根据情绪状态预测策略，并使用策略专属 trie 约束解码。</w:t>
+      </w:r>
+    </w:p>
+    <w:p>
+      <w:pPr>
+        <w:pStyle w:val="ListBullet"/>
+        <w:ind w:left="340" w:hanging="170"/>
+      </w:pPr>
+      <w:r>
+        <w:t>用模型自评、COMET 常识和 HEAL 治疗知识进行重排。</w:t>
+      </w:r>
+    </w:p>
+    <w:p>
+      <w:pPr>
+        <w:pStyle w:val="ListBullet"/>
+        <w:ind w:left="340" w:hanging="170"/>
+      </w:pPr>
+      <w:r>
+        <w:t>在 ESConv 上报告 46.8% Accuracy 和 38.95% Macro-F1。</w:t>
+      </w:r>
+    </w:p>
+    <w:p>
+      <w:pPr>
+        <w:pStyle w:val="Heading2"/>
+      </w:pPr>
+      <w:r>
+        <w:t>DPPLM</w:t>
+      </w:r>
+    </w:p>
+    <w:p>
+      <w:pPr>
+        <w:pStyle w:val="ListBullet"/>
+        <w:ind w:left="340" w:hanging="170"/>
+      </w:pPr>
+      <w:r>
+        <w:t>使用 emotion-cause entailment 跟踪求助者情绪及其原因。</w:t>
+      </w:r>
+    </w:p>
+    <w:p>
+      <w:pPr>
+        <w:pStyle w:val="ListBullet"/>
+        <w:ind w:left="340" w:hanging="170"/>
+      </w:pPr>
+      <w:r>
+        <w:t>通过两个属性模型控制策略与共情。</w:t>
+      </w:r>
+    </w:p>
+    <w:p>
+      <w:pPr>
+        <w:pStyle w:val="ListBullet"/>
+        <w:ind w:left="340" w:hanging="170"/>
+      </w:pPr>
+      <w:r>
+        <w:t>重点是判断什么时候开始引导，避免过早给建议。</w:t>
+      </w:r>
+    </w:p>
+    <w:p>
+      <w:pPr>
+        <w:pStyle w:val="Heading2"/>
+      </w:pPr>
+      <w:r>
+        <w:t>GREEN</w:t>
+      </w:r>
+    </w:p>
+    <w:p>
+      <w:pPr>
+        <w:pStyle w:val="ListBullet"/>
+        <w:ind w:left="340" w:hanging="170"/>
+      </w:pPr>
+      <w:r>
+        <w:t>从普通 embedding 相似度检索改成生成式检索。</w:t>
+      </w:r>
+    </w:p>
+    <w:p>
+      <w:pPr>
+        <w:pStyle w:val="ListBullet"/>
+        <w:ind w:left="340" w:hanging="170"/>
+      </w:pPr>
+      <w:r>
+        <w:t>使用 ResID 表示对话上下文、情绪、支持策略和回复类型。</w:t>
+      </w:r>
+    </w:p>
+    <w:p>
+      <w:pPr>
+        <w:pStyle w:val="ListBullet"/>
+        <w:ind w:left="340" w:hanging="170"/>
+      </w:pPr>
+      <w:r>
+        <w:t>论文使用后来扩充到 1,300 段对话的 ESConv，因此不能直接替换 2021 baseline。</w:t>
+      </w:r>
+    </w:p>
+    <w:p>
+      <w:pPr>
+        <w:pStyle w:val="Heading2"/>
+      </w:pPr>
+      <w:r>
+        <w:t>EmoDynamiX</w:t>
+      </w:r>
+    </w:p>
+    <w:p>
+      <w:pPr>
+        <w:pStyle w:val="ListBullet"/>
+        <w:ind w:left="340" w:hanging="170"/>
+      </w:pPr>
+      <w:r>
+        <w:t>把策略预测与回复生成解耦。</w:t>
+      </w:r>
+    </w:p>
+    <w:p>
+      <w:pPr>
+        <w:pStyle w:val="ListBullet"/>
+        <w:ind w:left="340" w:hanging="170"/>
+      </w:pPr>
+      <w:r>
+        <w:t>使用异构图建模用户细粒度情绪和系统策略之间的话语动态。</w:t>
+      </w:r>
+    </w:p>
+    <w:p>
+      <w:pPr>
+        <w:pStyle w:val="ListBullet"/>
+        <w:ind w:left="340" w:hanging="170"/>
+      </w:pPr>
+      <w:r>
+        <w:t>重点报告 F1、偏好偏差和可追溯性，不建议强行放进 Accuracy 排名。</w:t>
+      </w:r>
+    </w:p>
+    <w:p>
+      <w:pPr>
+        <w:pStyle w:val="Heading2"/>
+      </w:pPr>
+      <w:r>
+        <w:t>MultiESC</w:t>
+      </w:r>
+    </w:p>
+    <w:p>
+      <w:pPr>
+        <w:pStyle w:val="ListBullet"/>
+        <w:ind w:left="340" w:hanging="170"/>
+      </w:pPr>
+      <w:r>
+        <w:t>先建模多轮用户状态，再对未来策略进行 lookahead 规划。</w:t>
+      </w:r>
+    </w:p>
+    <w:p>
+      <w:pPr>
+        <w:pStyle w:val="ListBullet"/>
+        <w:ind w:left="340" w:hanging="170"/>
+      </w:pPr>
+      <w:r>
+        <w:t>原论文 Table 3 报告 Accuracy 42.01%、Weighted-F1 34.01%。</w:t>
+      </w:r>
+    </w:p>
+    <w:p>
+      <w:pPr>
+        <w:pStyle w:val="ListBullet"/>
+        <w:ind w:left="340" w:hanging="170"/>
+      </w:pPr>
+      <w:r>
+        <w:t>其标签和数据处理经过修改，必须写明论文协议。</w:t>
       </w:r>
     </w:p>
     <w:p>
@@ -1243,32 +1664,108 @@
         <w:pStyle w:val="Heading1"/>
       </w:pPr>
       <w:r>
-        <w:t>7. 文件</w:t>
+        <w:t>6. 我们实际运行到哪里</w:t>
+      </w:r>
+    </w:p>
+    <w:p>
+      <w:pPr>
+        <w:pStyle w:val="ListBullet"/>
+        <w:ind w:left="340" w:hanging="170"/>
+      </w:pPr>
+      <w:r>
+        <w:t>已经完成作者官方 Joint checkpoint 的修正 token 映射重放。</w:t>
+      </w:r>
+    </w:p>
+    <w:p>
+      <w:pPr>
+        <w:pStyle w:val="ListBullet"/>
+        <w:ind w:left="340" w:hanging="170"/>
+      </w:pPr>
+      <w:r>
+        <w:t>full 2,775 暂定为 32.2162%，即 894/2,775。</w:t>
+      </w:r>
+    </w:p>
+    <w:p>
+      <w:pPr>
+        <w:pStyle w:val="ListBullet"/>
+        <w:ind w:left="340" w:hanging="170"/>
+      </w:pPr>
+      <w:r>
+        <w:t>fixed250 暂定为 37.60%，即 94/250。</w:t>
+      </w:r>
+    </w:p>
+    <w:p>
+      <w:pPr>
+        <w:pStyle w:val="ListBullet"/>
+        <w:ind w:left="340" w:hanging="170"/>
+      </w:pPr>
+      <w:r>
+        <w:t>这不是从随机权重重新训练 5 epochs。</w:t>
+      </w:r>
+    </w:p>
+    <w:p>
+      <w:pPr>
+        <w:pStyle w:val="ListBullet"/>
+        <w:ind w:left="340" w:hanging="170"/>
+      </w:pPr>
+      <w:r>
+        <w:t>下一步是在原始冻结依赖环境里重跑，并保存每条样本的 gold、prediction 和 token ID。</w:t>
+      </w:r>
+    </w:p>
+    <w:p>
+      <w:pPr>
+        <w:pStyle w:val="Heading1"/>
+      </w:pPr>
+      <w:r>
+        <w:t>7. 最后采用的写法</w:t>
       </w:r>
     </w:p>
     <w:p>
       <w:r>
-        <w:t>原论文：https://aclanthology.org/2021.acl-long.269/</w:t>
+        <w:t>本项目选用 ESConv。历史模型参考采用修正后的 2021 ESC Blender Joint checkpoint 重放结果：full-test Accuracy 暂定 32.22%，fixed250 暂定 37.60%；Causal-ESC 的 53.53%仅作为后续文献参考成绩，不作为同协议 baseline。DeepSeek V4-Pro 和未微调 Qwen3.6-27B 在 fixed250 上分别为 14.80%和14.00%。</w:t>
+      </w:r>
+    </w:p>
+    <w:p>
+      <w:pPr>
+        <w:pStyle w:val="Heading1"/>
+      </w:pPr>
+      <w:r>
+        <w:t>8. 来源</w:t>
       </w:r>
     </w:p>
     <w:p>
       <w:r>
-        <w:t>官方仓库：https://github.com/thu-coai/Emotional-Support-Conversation</w:t>
+        <w:t>ESConv 原论文：https://aclanthology.org/2021.acl-long.269/</w:t>
       </w:r>
     </w:p>
     <w:p>
       <w:r>
-        <w:t>复算脚本：/Users/allenli/Desktop/mental-health-llm-eval/scripts/eval_esconv_original_joint.py</w:t>
+        <w:t>Causal-ESC：https://aclanthology.org/2026.acl-long.886/</w:t>
       </w:r>
     </w:p>
     <w:p>
       <w:r>
-        <w:t>全量结果：/Users/allenli/Desktop/mental-health-llm-eval/reports/esconv_original_joint_official_test_20260810.json</w:t>
+        <w:t>SAGE：https://www.sciencedirect.com/science/article/pii/S0957417426004379</w:t>
       </w:r>
     </w:p>
     <w:p>
       <w:r>
-        <w:t>250 条结果：/Users/allenli/Desktop/mental-health-llm-eval/reports/esconv_original_joint_fixed250_20260810.json</w:t>
+        <w:t>DPPLM：https://researchoutput.ncku.edu.tw/en/publications/applying-emotion-cause-entailment-for-help-seeker-guidance-in-emo/</w:t>
+      </w:r>
+    </w:p>
+    <w:p>
+      <w:r>
+        <w:t>GREEN：https://journals.sagepub.com/doi/10.1177/21582440251395922</w:t>
+      </w:r>
+    </w:p>
+    <w:p>
+      <w:r>
+        <w:t>EmoDynamiX：https://aclanthology.org/2025.naacl-long.81/</w:t>
+      </w:r>
+    </w:p>
+    <w:p>
+      <w:r>
+        <w:t>MultiESC：https://aclanthology.org/2022.emnlp-main.195/</w:t>
       </w:r>
     </w:p>
     <w:sectPr>

</xml_diff>